<commit_message>
docs: put the figures where the prose was doing the drawing
Nine standalone ASCII flows become SVG or cross-references to the figure
set, and the six Word/PDF exports are re-rendered with native SVG plus PNG
fallbacks (105 PDF pages, diagrams still vector). Commands, JSON, C++ and
directory trees stay as text — only prose that existed to draw a box lost
its boxes.
</commit_message>
<xml_diff>
--- a/docs/EulerPilot-v2参赛文档-v1.1.docx
+++ b/docs/EulerPilot-v2参赛文档-v1.1.docx
@@ -2,7 +2,7 @@
 <file path=word/document.xml><?xml version="1.0" encoding="utf-8"?>
 <w:document xmlns:w="http://schemas.openxmlformats.org/wordprocessingml/2006/main" xmlns:m="http://schemas.openxmlformats.org/officeDocument/2006/math" xmlns:r="http://schemas.openxmlformats.org/officeDocument/2006/relationships" xmlns:o="urn:schemas-microsoft-com:office:office" xmlns:v="urn:schemas-microsoft-com:vml" xmlns:w10="urn:schemas-microsoft-com:office:word" xmlns:a="http://schemas.openxmlformats.org/drawingml/2006/main" xmlns:pic="http://schemas.openxmlformats.org/drawingml/2006/picture" xmlns:wp="http://schemas.openxmlformats.org/drawingml/2006/wordprocessingDrawing">
   <w:body>
-    <w:bookmarkStart w:id="21" w:name="eulerpilot-v2-参赛文档"/>
+    <w:bookmarkStart w:id="27" w:name="eulerpilot-v2-参赛文档"/>
     <w:p>
       <w:pPr>
         <w:pStyle w:val="Heading1"/>
@@ -382,7 +382,7 @@
               <w:pStyle w:val="Compact"/>
             </w:pPr>
             <w:r>
-              <w:t xml:space="preserve">2026-10-25</w:t>
+              <w:t xml:space="preserve">2026-10-26</w:t>
             </w:r>
           </w:p>
         </w:tc>
@@ -1211,7 +1211,7 @@
       </w:r>
     </w:p>
     <w:bookmarkEnd w:id="10"/>
-    <w:bookmarkStart w:id="11" w:name="系统框架设计"/>
+    <w:bookmarkStart w:id="14" w:name="系统框架设计"/>
     <w:p>
       <w:pPr>
         <w:pStyle w:val="Heading2"/>
@@ -1228,359 +1228,95 @@
     </w:p>
     <w:p>
       <w:pPr>
-        <w:pStyle w:val="SourceCode"/>
-      </w:pPr>
-      <w:r>
-        <w:rPr>
-          <w:rStyle w:val="VerbatimChar"/>
-        </w:rPr>
-        <w:t xml:space="preserve">┌─ </w:t>
-      </w:r>
-      <w:r>
-        <w:rPr>
-          <w:rStyle w:val="VerbatimChar"/>
-          <w:rFonts w:hint="eastAsia"/>
-        </w:rPr>
-        <w:t xml:space="preserve">决策层(默认</w:t>
-      </w:r>
-      <w:r>
-        <w:rPr>
-          <w:rStyle w:val="VerbatimChar"/>
-        </w:rPr>
-        <w:t xml:space="preserve"> advisory)────────────────────────────────┐</w:t>
-      </w:r>
-      <w:r>
-        <w:br/>
-      </w:r>
-      <w:r>
-        <w:rPr>
-          <w:rStyle w:val="VerbatimChar"/>
-        </w:rPr>
-        <w:t xml:space="preserve">│ FeatureWindow(CPU/load/PSI)→ </w:t>
-      </w:r>
-      <w:r>
-        <w:rPr>
-          <w:rStyle w:val="VerbatimChar"/>
-          <w:rFonts w:hint="eastAsia"/>
-        </w:rPr>
-        <w:t xml:space="preserve">规则路由</w:t>
-      </w:r>
-      <w:r>
-        <w:rPr>
-          <w:rStyle w:val="VerbatimChar"/>
-        </w:rPr>
-        <w:t xml:space="preserve"> → SLO </w:t>
-      </w:r>
-      <w:r>
-        <w:rPr>
-          <w:rStyle w:val="VerbatimChar"/>
-          <w:rFonts w:hint="eastAsia"/>
-        </w:rPr>
-        <w:t xml:space="preserve">门控</w:t>
-      </w:r>
-      <w:r>
-        <w:rPr>
-          <w:rStyle w:val="VerbatimChar"/>
-        </w:rPr>
-        <w:t xml:space="preserve"> → AutoPilot │</w:t>
-      </w:r>
-      <w:r>
-        <w:br/>
-      </w:r>
-      <w:r>
-        <w:rPr>
-          <w:rStyle w:val="VerbatimChar"/>
-        </w:rPr>
-        <w:t xml:space="preserve">│ </w:t>
-      </w:r>
-      <w:r>
-        <w:rPr>
-          <w:rStyle w:val="VerbatimChar"/>
-          <w:rFonts w:hint="eastAsia"/>
-        </w:rPr>
-        <w:t xml:space="preserve">服务观测(service.observe)/</w:t>
-      </w:r>
-      <w:r>
-        <w:rPr>
-          <w:rStyle w:val="VerbatimChar"/>
-        </w:rPr>
-        <w:t xml:space="preserve"> </w:t>
-      </w:r>
-      <w:r>
-        <w:rPr>
-          <w:rStyle w:val="VerbatimChar"/>
-          <w:rFonts w:hint="eastAsia"/>
-        </w:rPr>
-        <w:t xml:space="preserve">事件观测(event.observe)——只能更严</w:t>
-      </w:r>
-      <w:r>
-        <w:rPr>
-          <w:rStyle w:val="VerbatimChar"/>
-        </w:rPr>
-        <w:t xml:space="preserve"> │</w:t>
-      </w:r>
-      <w:r>
-        <w:br/>
-      </w:r>
-      <w:r>
-        <w:rPr>
-          <w:rStyle w:val="VerbatimChar"/>
-        </w:rPr>
-        <w:t xml:space="preserve">└───────────────┬──────────────────────────────────┘</w:t>
-      </w:r>
-      <w:r>
-        <w:br/>
-      </w:r>
-      <w:r>
-        <w:rPr>
-          <w:rStyle w:val="VerbatimChar"/>
-        </w:rPr>
-        <w:t xml:space="preserve">                │ </w:t>
-      </w:r>
-      <w:r>
-        <w:rPr>
-          <w:rStyle w:val="VerbatimChar"/>
-          <w:rFonts w:hint="eastAsia"/>
-        </w:rPr>
-        <w:t xml:space="preserve">声明式策略(JSON</w:t>
-      </w:r>
-      <w:r>
-        <w:rPr>
-          <w:rStyle w:val="VerbatimChar"/>
-        </w:rPr>
-        <w:t xml:space="preserve"> Schema + </w:t>
-      </w:r>
-      <w:r>
-        <w:rPr>
-          <w:rStyle w:val="VerbatimChar"/>
-          <w:rFonts w:hint="eastAsia"/>
-        </w:rPr>
-        <w:t xml:space="preserve">语义校验)</w:t>
-      </w:r>
-      <w:r>
-        <w:br/>
-      </w:r>
-      <w:r>
-        <w:rPr>
-          <w:rStyle w:val="VerbatimChar"/>
-        </w:rPr>
-        <w:t xml:space="preserve">┌───────────────▼──────────────────────────────────┐</w:t>
-      </w:r>
-      <w:r>
-        <w:br/>
-      </w:r>
-      <w:r>
-        <w:rPr>
-          <w:rStyle w:val="VerbatimChar"/>
-        </w:rPr>
-        <w:t xml:space="preserve">│ ep-executord </w:t>
-      </w:r>
-      <w:r>
-        <w:rPr>
-          <w:rStyle w:val="VerbatimChar"/>
-          <w:rFonts w:hint="eastAsia"/>
-        </w:rPr>
-        <w:t xml:space="preserve">唯一特权写者:flock</w:t>
-      </w:r>
-      <w:r>
-        <w:rPr>
-          <w:rStyle w:val="VerbatimChar"/>
-        </w:rPr>
-        <w:t xml:space="preserve"> </w:t>
-      </w:r>
-      <w:r>
-        <w:rPr>
-          <w:rStyle w:val="VerbatimChar"/>
-          <w:rFonts w:hint="eastAsia"/>
-        </w:rPr>
-        <w:t xml:space="preserve">单实例、lease/fence、</w:t>
-      </w:r>
-      <w:r>
-        <w:rPr>
-          <w:rStyle w:val="VerbatimChar"/>
-        </w:rPr>
-        <w:t xml:space="preserve">    │</w:t>
-      </w:r>
-      <w:r>
-        <w:br/>
-      </w:r>
-      <w:r>
-        <w:rPr>
-          <w:rStyle w:val="VerbatimChar"/>
-        </w:rPr>
-        <w:t xml:space="preserve">│ generation、append-only </w:t>
-      </w:r>
-      <w:r>
-        <w:rPr>
-          <w:rStyle w:val="VerbatimChar"/>
-          <w:rFonts w:hint="eastAsia"/>
-        </w:rPr>
-        <w:t xml:space="preserve">WAL、事务状态机、幂等、崩溃</w:t>
-      </w:r>
-      <w:r>
-        <w:rPr>
-          <w:rStyle w:val="VerbatimChar"/>
-        </w:rPr>
-        <w:t xml:space="preserve"> reconcile│</w:t>
-      </w:r>
-      <w:r>
-        <w:br/>
-      </w:r>
-      <w:r>
-        <w:rPr>
-          <w:rStyle w:val="VerbatimChar"/>
-        </w:rPr>
-        <w:t xml:space="preserve">└───────┬──────────────────────────────────┬───────┘</w:t>
-      </w:r>
-      <w:r>
-        <w:br/>
-      </w:r>
-      <w:r>
-        <w:rPr>
-          <w:rStyle w:val="VerbatimChar"/>
-        </w:rPr>
-        <w:t xml:space="preserve">   sched </w:t>
-      </w:r>
-      <w:r>
-        <w:rPr>
-          <w:rStyle w:val="VerbatimChar"/>
-          <w:rFonts w:hint="eastAsia"/>
-        </w:rPr>
-        <w:t xml:space="preserve">域</w:t>
-      </w:r>
-      <w:r>
-        <w:rPr>
-          <w:rStyle w:val="VerbatimChar"/>
-        </w:rPr>
-        <w:t xml:space="preserve">                            cgroup </w:t>
-      </w:r>
-      <w:r>
-        <w:rPr>
-          <w:rStyle w:val="VerbatimChar"/>
-          <w:rFonts w:hint="eastAsia"/>
-        </w:rPr>
-        <w:t xml:space="preserve">域</w:t>
-      </w:r>
-      <w:r>
-        <w:br/>
-      </w:r>
-      <w:r>
-        <w:rPr>
-          <w:rStyle w:val="VerbatimChar"/>
-        </w:rPr>
-        <w:t xml:space="preserve"> v2 </w:t>
-      </w:r>
-      <w:r>
-        <w:rPr>
-          <w:rStyle w:val="VerbatimChar"/>
-          <w:rFonts w:hint="eastAsia"/>
-        </w:rPr>
-        <w:t xml:space="preserve">自建</w:t>
-      </w:r>
-      <w:r>
-        <w:rPr>
-          <w:rStyle w:val="VerbatimChar"/>
-        </w:rPr>
-        <w:t xml:space="preserve"> loader(ops `eulerpilot`),       </w:t>
-      </w:r>
-      <w:r>
-        <w:rPr>
-          <w:rStyle w:val="VerbatimChar"/>
-          <w:rFonts w:hint="eastAsia"/>
-        </w:rPr>
-        <w:t xml:space="preserve">cpu.weight(写后读回</w:t>
-      </w:r>
-      <w:r>
-        <w:rPr>
-          <w:rStyle w:val="VerbatimChar"/>
-        </w:rPr>
-        <w:t xml:space="preserve"> +</w:t>
-      </w:r>
-      <w:r>
-        <w:br/>
-      </w:r>
-      <w:r>
-        <w:rPr>
-          <w:rStyle w:val="VerbatimChar"/>
-        </w:rPr>
-        <w:t xml:space="preserve"> link FD </w:t>
-      </w:r>
-      <w:r>
-        <w:rPr>
-          <w:rStyle w:val="VerbatimChar"/>
-          <w:rFonts w:hint="eastAsia"/>
-        </w:rPr>
-        <w:t xml:space="preserve">经</w:t>
-      </w:r>
-      <w:r>
-        <w:rPr>
-          <w:rStyle w:val="VerbatimChar"/>
-        </w:rPr>
-        <w:t xml:space="preserve"> SCM_RIGHTS </w:t>
-      </w:r>
-      <w:r>
-        <w:rPr>
-          <w:rStyle w:val="VerbatimChar"/>
-          <w:rFonts w:hint="eastAsia"/>
-        </w:rPr>
-        <w:t xml:space="preserve">交执行服务持有</w:t>
-      </w:r>
-      <w:r>
-        <w:rPr>
-          <w:rStyle w:val="VerbatimChar"/>
-        </w:rPr>
-        <w:t xml:space="preserve">      marker </w:t>
-      </w:r>
-      <w:r>
-        <w:rPr>
-          <w:rStyle w:val="VerbatimChar"/>
-          <w:rFonts w:hint="eastAsia"/>
-        </w:rPr>
-        <w:t xml:space="preserve">崩溃恢复</w:t>
-      </w:r>
-      <w:r>
-        <w:rPr>
-          <w:rStyle w:val="VerbatimChar"/>
-        </w:rPr>
-        <w:t xml:space="preserve"> + </w:t>
-      </w:r>
-      <w:r>
-        <w:rPr>
-          <w:rStyle w:val="VerbatimChar"/>
-          <w:rFonts w:hint="eastAsia"/>
-        </w:rPr>
-        <w:t xml:space="preserve">事件守卫)</w:t>
-      </w:r>
-      <w:r>
-        <w:br/>
-      </w:r>
-      <w:r>
-        <w:rPr>
-          <w:rStyle w:val="VerbatimChar"/>
-        </w:rPr>
-        <w:t xml:space="preserve">└───────┴──────────────────────────────────┴───────┘</w:t>
-      </w:r>
-      <w:r>
-        <w:br/>
-      </w:r>
-      <w:r>
-        <w:rPr>
-          <w:rStyle w:val="VerbatimChar"/>
-        </w:rPr>
-        <w:t xml:space="preserve">      </w:t>
-      </w:r>
-      <w:r>
-        <w:rPr>
-          <w:rStyle w:val="VerbatimChar"/>
-          <w:rFonts w:hint="eastAsia"/>
-        </w:rPr>
-        <w:t xml:space="preserve">内核:sched_ext</w:t>
-      </w:r>
-      <w:r>
-        <w:rPr>
-          <w:rStyle w:val="VerbatimChar"/>
-        </w:rPr>
-        <w:t xml:space="preserve"> maps / cgroup v2 / raw tracepoints</w:t>
+        <w:pStyle w:val="FirstParagraph"/>
+        <w:keepNext/>
+        <w:spacing w:before="160" w:after="80"/>
+        <w:jc w:val="center"/>
+      </w:pPr>
+      <w:r>
+        <w:drawing>
+          <wp:inline>
+            <wp:extent cx="5334000" cy="5334000"/>
+            <wp:effectExtent b="0" l="0" r="0" t="0"/>
+            <wp:docPr descr="EulerPilot v2 总体架构" title="" id="12" name="Picture"/>
+            <a:graphic>
+              <a:graphicData uri="http://schemas.openxmlformats.org/drawingml/2006/picture">
+                <pic:pic>
+                  <pic:nvPicPr>
+                    <pic:cNvPr descr="D:/code/Ubuntu/EulerPilot-v2/build/diagram-qa/png/system-architecture.png" id="13" name="Picture"/>
+                    <pic:cNvPicPr>
+                      <a:picLocks noChangeArrowheads="1" noChangeAspect="1"/>
+                    </pic:cNvPicPr>
+                  </pic:nvPicPr>
+                  <pic:blipFill>
+                    <a:blip r:embed="rId11">
+                      <a:extLst>
+                        <a:ext uri="{96DAC541-7B7A-43D3-8B79-37D633B846F1}">
+                          <asvg:svgBlip xmlns:asvg="http://schemas.microsoft.com/office/drawing/2016/SVG/main" r:embed="rIdSvg2"/>
+                        </a:ext>
+                      </a:extLst>
+                    </a:blip>
+                    <a:stretch>
+                      <a:fillRect/>
+                    </a:stretch>
+                  </pic:blipFill>
+                  <pic:spPr bwMode="auto">
+                    <a:xfrm>
+                      <a:off x="0" y="0"/>
+                      <a:ext cx="5334000" cy="5334000"/>
+                    </a:xfrm>
+                    <a:prstGeom prst="rect">
+                      <a:avLst/>
+                    </a:prstGeom>
+                    <a:noFill/>
+                    <a:ln w="9525">
+                      <a:noFill/>
+                      <a:headEnd/>
+                      <a:tailEnd/>
+                    </a:ln>
+                  </pic:spPr>
+                </pic:pic>
+              </a:graphicData>
+            </a:graphic>
+          </wp:inline>
+        </w:drawing>
+      </w:r>
+    </w:p>
+    <w:p>
+      <w:pPr>
+        <w:pStyle w:val="BodyText"/>
+        <w:keepNext w:val="0"/>
+        <w:spacing w:after="200"/>
+        <w:jc w:val="center"/>
+      </w:pPr>
+      <w:r>
+        <w:rPr>
+          <w:rFonts w:hint="eastAsia"/>
+          <w:i/>
+          <w:iCs/>
+          <w:color w:val="595959"/>
+          <w:sz w:val="18"/>
+        </w:rPr>
+        <w:t xml:space="preserve">图</w:t>
+      </w:r>
+      <w:r>
+        <w:rPr>
+          <w:i/>
+          <w:iCs/>
+          <w:color w:val="595959"/>
+          <w:sz w:val="18"/>
+        </w:rPr>
+        <w:t xml:space="preserve"> 1　EulerPilot v2 </w:t>
+      </w:r>
+      <w:r>
+        <w:rPr>
+          <w:rFonts w:hint="eastAsia"/>
+          <w:i/>
+          <w:iCs/>
+          <w:color w:val="595959"/>
+          <w:sz w:val="18"/>
+        </w:rPr>
+        <w:t xml:space="preserve">总体架构</w:t>
       </w:r>
     </w:p>
     <w:p>
@@ -1912,8 +1648,8 @@
         <w:t xml:space="preserve">;观测断供必须可报告;生产端周期必须严格快于新鲜度判据。</w:t>
       </w:r>
     </w:p>
-    <w:bookmarkEnd w:id="11"/>
-    <w:bookmarkStart w:id="12" w:name="开发计划"/>
+    <w:bookmarkEnd w:id="14"/>
+    <w:bookmarkStart w:id="15" w:name="开发计划"/>
     <w:p>
       <w:pPr>
         <w:pStyle w:val="Heading2"/>
@@ -2496,8 +2232,8 @@
         </w:tc>
       </w:tr>
     </w:tbl>
-    <w:bookmarkEnd w:id="12"/>
-    <w:bookmarkStart w:id="14" w:name="比赛过程中的重要进展"/>
+    <w:bookmarkEnd w:id="15"/>
+    <w:bookmarkStart w:id="17" w:name="比赛过程中的重要进展"/>
     <w:p>
       <w:pPr>
         <w:pStyle w:val="Heading2"/>
@@ -2882,7 +2618,7 @@
         </w:rPr>
         <w:t xml:space="preserve"> </w:t>
       </w:r>
-      <w:hyperlink r:id="rId13">
+      <w:hyperlink r:id="rId16">
         <w:r>
           <w:rPr>
             <w:rStyle w:val="Hyperlink"/>
@@ -2923,8 +2659,8 @@
         <w:t xml:space="preserve">D);演示三连彩排;交付镜像与包校验。</w:t>
       </w:r>
     </w:p>
-    <w:bookmarkEnd w:id="14"/>
-    <w:bookmarkStart w:id="15" w:name="系统测试情况"/>
+    <w:bookmarkEnd w:id="17"/>
+    <w:bookmarkStart w:id="21" w:name="系统测试情况"/>
     <w:p>
       <w:pPr>
         <w:pStyle w:val="Heading2"/>
@@ -2937,6 +2673,99 @@
           <w:rFonts w:hint="eastAsia"/>
         </w:rPr>
         <w:t xml:space="preserve">系统测试情况</w:t>
+      </w:r>
+    </w:p>
+    <w:p>
+      <w:pPr>
+        <w:pStyle w:val="FirstParagraph"/>
+        <w:keepNext/>
+        <w:spacing w:before="160" w:after="80"/>
+        <w:jc w:val="center"/>
+      </w:pPr>
+      <w:r>
+        <w:drawing>
+          <wp:inline>
+            <wp:extent cx="5334000" cy="5081587"/>
+            <wp:effectExtent b="0" l="0" r="0" t="0"/>
+            <wp:docPr descr="同预算的配对实验设计" title="" id="19" name="Picture"/>
+            <a:graphic>
+              <a:graphicData uri="http://schemas.openxmlformats.org/drawingml/2006/picture">
+                <pic:pic>
+                  <pic:nvPicPr>
+                    <pic:cNvPr descr="D:/code/Ubuntu/EulerPilot-v2/build/diagram-qa/png/experiment-design.png" id="20" name="Picture"/>
+                    <pic:cNvPicPr>
+                      <a:picLocks noChangeArrowheads="1" noChangeAspect="1"/>
+                    </pic:cNvPicPr>
+                  </pic:nvPicPr>
+                  <pic:blipFill>
+                    <a:blip r:embed="rId18">
+                      <a:extLst>
+                        <a:ext uri="{96DAC541-7B7A-43D3-8B79-37D633B846F1}">
+                          <asvg:svgBlip xmlns:asvg="http://schemas.microsoft.com/office/drawing/2016/SVG/main" r:embed="rIdSvg1"/>
+                        </a:ext>
+                      </a:extLst>
+                    </a:blip>
+                    <a:stretch>
+                      <a:fillRect/>
+                    </a:stretch>
+                  </pic:blipFill>
+                  <pic:spPr bwMode="auto">
+                    <a:xfrm>
+                      <a:off x="0" y="0"/>
+                      <a:ext cx="5334000" cy="5081587"/>
+                    </a:xfrm>
+                    <a:prstGeom prst="rect">
+                      <a:avLst/>
+                    </a:prstGeom>
+                    <a:noFill/>
+                    <a:ln w="9525">
+                      <a:noFill/>
+                      <a:headEnd/>
+                      <a:tailEnd/>
+                    </a:ln>
+                  </pic:spPr>
+                </pic:pic>
+              </a:graphicData>
+            </a:graphic>
+          </wp:inline>
+        </w:drawing>
+      </w:r>
+    </w:p>
+    <w:p>
+      <w:pPr>
+        <w:pStyle w:val="BodyText"/>
+        <w:keepNext w:val="0"/>
+        <w:spacing w:after="200"/>
+        <w:jc w:val="center"/>
+      </w:pPr>
+      <w:r>
+        <w:rPr>
+          <w:rFonts w:hint="eastAsia"/>
+          <w:i/>
+          <w:iCs/>
+          <w:color w:val="595959"/>
+          <w:sz w:val="18"/>
+        </w:rPr>
+        <w:t xml:space="preserve">图</w:t>
+      </w:r>
+      <w:r>
+        <w:rPr>
+          <w:i/>
+          <w:iCs/>
+          <w:color w:val="595959"/>
+          <w:sz w:val="18"/>
+        </w:rPr>
+        <w:t xml:space="preserve"> 2　</w:t>
+      </w:r>
+      <w:r>
+        <w:rPr>
+          <w:rFonts w:hint="eastAsia"/>
+          <w:i/>
+          <w:iCs/>
+          <w:color w:val="595959"/>
+          <w:sz w:val="18"/>
+        </w:rPr>
+        <w:t xml:space="preserve">同预算的配对实验设计</w:t>
       </w:r>
     </w:p>
     <w:tbl>
@@ -4064,8 +3893,8 @@
         <w:t xml:space="preserve">。</w:t>
       </w:r>
     </w:p>
-    <w:bookmarkEnd w:id="15"/>
-    <w:bookmarkStart w:id="16" w:name="遇到的主要问题和解决方法"/>
+    <w:bookmarkEnd w:id="21"/>
+    <w:bookmarkStart w:id="22" w:name="遇到的主要问题和解决方法"/>
     <w:p>
       <w:pPr>
         <w:pStyle w:val="Heading2"/>
@@ -4833,8 +4662,8 @@
         </w:tc>
       </w:tr>
     </w:tbl>
-    <w:bookmarkEnd w:id="16"/>
-    <w:bookmarkStart w:id="17" w:name="分工和协作"/>
+    <w:bookmarkEnd w:id="22"/>
+    <w:bookmarkStart w:id="23" w:name="分工和协作"/>
     <w:p>
       <w:pPr>
         <w:pStyle w:val="Heading2"/>
@@ -4991,8 +4820,8 @@
         <w:t xml:space="preserve">变更必须同步示例/校验/文档;实验改动晚于冻结构建的必须重跑对应矩阵;证据文件含完整性与边界章节,负结果与失败现场全部保留。</w:t>
       </w:r>
     </w:p>
-    <w:bookmarkEnd w:id="17"/>
-    <w:bookmarkStart w:id="18" w:name="提交仓库目录和文件描述"/>
+    <w:bookmarkEnd w:id="23"/>
+    <w:bookmarkStart w:id="24" w:name="提交仓库目录和文件描述"/>
     <w:p>
       <w:pPr>
         <w:pStyle w:val="Heading2"/>
@@ -5010,6 +4839,7 @@
     <w:p>
       <w:pPr>
         <w:pStyle w:val="SourceCode"/>
+        <w:keepNext w:val="0"/>
       </w:pPr>
       <w:r>
         <w:rPr>
@@ -5436,8 +5266,8 @@
         <w:t xml:space="preserve">末节)。</w:t>
       </w:r>
     </w:p>
-    <w:bookmarkEnd w:id="18"/>
-    <w:bookmarkStart w:id="19" w:name="比赛收获"/>
+    <w:bookmarkEnd w:id="24"/>
+    <w:bookmarkStart w:id="25" w:name="比赛收获"/>
     <w:p>
       <w:pPr>
         <w:pStyle w:val="Heading2"/>
@@ -5694,8 +5524,8 @@
         <w:t xml:space="preserve">说清楚,与把”做了”说清楚同样构成可信度。</w:t>
       </w:r>
     </w:p>
-    <w:bookmarkEnd w:id="19"/>
-    <w:bookmarkStart w:id="20" w:name="修订记录"/>
+    <w:bookmarkEnd w:id="25"/>
+    <w:bookmarkStart w:id="26" w:name="修订记录"/>
     <w:p>
       <w:pPr>
         <w:pStyle w:val="Heading2"/>
@@ -5734,15 +5564,18 @@
       <w:tr>
         <w:trPr>
           <w:tblHeader w:val="on"/>
+          <w:cantSplit/>
         </w:trPr>
         <w:tc>
           <w:tcPr>
+            <w:tcW w:type="dxa" w:w="1361"/>
             <w:shd w:val="clear" w:color="auto" w:fill="1F4E79"/>
             <w:vAlign w:val="center"/>
           </w:tcPr>
           <w:p>
             <w:pPr>
               <w:pStyle w:val="Compact"/>
+              <w:keepNext/>
             </w:pPr>
             <w:r>
               <w:rPr>
@@ -5754,12 +5587,14 @@
         </w:tc>
         <w:tc>
           <w:tcPr>
+            <w:tcW w:type="dxa" w:w="1417"/>
             <w:shd w:val="clear" w:color="auto" w:fill="1F4E79"/>
             <w:vAlign w:val="center"/>
           </w:tcPr>
           <w:p>
             <w:pPr>
               <w:pStyle w:val="Compact"/>
+              <w:keepNext/>
             </w:pPr>
             <w:r>
               <w:rPr>
@@ -5771,12 +5606,14 @@
         </w:tc>
         <w:tc>
           <w:tcPr>
+            <w:tcW w:type="dxa" w:w="4989"/>
             <w:shd w:val="clear" w:color="auto" w:fill="1F4E79"/>
             <w:vAlign w:val="center"/>
           </w:tcPr>
           <w:p>
             <w:pPr>
               <w:pStyle w:val="Compact"/>
+              <w:keepNext/>
             </w:pPr>
             <w:r>
               <w:rPr>
@@ -5788,12 +5625,14 @@
         </w:tc>
         <w:tc>
           <w:tcPr>
+            <w:tcW w:type="dxa" w:w="1417"/>
             <w:shd w:val="clear" w:color="auto" w:fill="1F4E79"/>
             <w:vAlign w:val="center"/>
           </w:tcPr>
           <w:p>
             <w:pPr>
               <w:pStyle w:val="Compact"/>
+              <w:keepNext/>
             </w:pPr>
             <w:r>
               <w:rPr>
@@ -5805,11 +5644,17 @@
         </w:tc>
       </w:tr>
       <w:tr>
-        <w:tc>
-          <w:tcPr/>
-          <w:p>
-            <w:pPr>
-              <w:pStyle w:val="Compact"/>
+        <w:trPr>
+          <w:cantSplit/>
+        </w:trPr>
+        <w:tc>
+          <w:tcPr>
+            <w:tcW w:type="dxa" w:w="1361"/>
+          </w:tcPr>
+          <w:p>
+            <w:pPr>
+              <w:pStyle w:val="Compact"/>
+              <w:keepNext/>
             </w:pPr>
             <w:r>
               <w:t xml:space="preserve">v1.0</w:t>
@@ -5817,10 +5662,13 @@
           </w:p>
         </w:tc>
         <w:tc>
-          <w:tcPr/>
-          <w:p>
-            <w:pPr>
-              <w:pStyle w:val="Compact"/>
+          <w:tcPr>
+            <w:tcW w:type="dxa" w:w="1417"/>
+          </w:tcPr>
+          <w:p>
+            <w:pPr>
+              <w:pStyle w:val="Compact"/>
+              <w:keepNext/>
             </w:pPr>
             <w:r>
               <w:t xml:space="preserve">2026-10-25</w:t>
@@ -5828,10 +5676,13 @@
           </w:p>
         </w:tc>
         <w:tc>
-          <w:tcPr/>
-          <w:p>
-            <w:pPr>
-              <w:pStyle w:val="Compact"/>
+          <w:tcPr>
+            <w:tcW w:type="dxa" w:w="4989"/>
+          </w:tcPr>
+          <w:p>
+            <w:pPr>
+              <w:pStyle w:val="Compact"/>
+              <w:keepNext/>
             </w:pPr>
             <w:r>
               <w:rPr>
@@ -5842,10 +5693,13 @@
           </w:p>
         </w:tc>
         <w:tc>
-          <w:tcPr/>
-          <w:p>
-            <w:pPr>
-              <w:pStyle w:val="Compact"/>
+          <w:tcPr>
+            <w:tcW w:type="dxa" w:w="1417"/>
+          </w:tcPr>
+          <w:p>
+            <w:pPr>
+              <w:pStyle w:val="Compact"/>
+              <w:keepNext/>
             </w:pPr>
             <w:r>
               <w:rPr>
@@ -5857,11 +5711,17 @@
         </w:tc>
       </w:tr>
       <w:tr>
-        <w:tc>
-          <w:tcPr/>
-          <w:p>
-            <w:pPr>
-              <w:pStyle w:val="Compact"/>
+        <w:trPr>
+          <w:cantSplit/>
+        </w:trPr>
+        <w:tc>
+          <w:tcPr>
+            <w:tcW w:type="dxa" w:w="1361"/>
+          </w:tcPr>
+          <w:p>
+            <w:pPr>
+              <w:pStyle w:val="Compact"/>
+              <w:keepNext/>
             </w:pPr>
             <w:r>
               <w:t xml:space="preserve">v1.1</w:t>
@@ -5869,10 +5729,13 @@
           </w:p>
         </w:tc>
         <w:tc>
-          <w:tcPr/>
-          <w:p>
-            <w:pPr>
-              <w:pStyle w:val="Compact"/>
+          <w:tcPr>
+            <w:tcW w:type="dxa" w:w="1417"/>
+          </w:tcPr>
+          <w:p>
+            <w:pPr>
+              <w:pStyle w:val="Compact"/>
+              <w:keepNext/>
             </w:pPr>
             <w:r>
               <w:t xml:space="preserve">2026-10-25</w:t>
@@ -5880,10 +5743,13 @@
           </w:p>
         </w:tc>
         <w:tc>
-          <w:tcPr/>
-          <w:p>
-            <w:pPr>
-              <w:pStyle w:val="Compact"/>
+          <w:tcPr>
+            <w:tcW w:type="dxa" w:w="4989"/>
+          </w:tcPr>
+          <w:p>
+            <w:pPr>
+              <w:pStyle w:val="Compact"/>
+              <w:keepNext/>
             </w:pPr>
             <w:r>
               <w:rPr>
@@ -5903,10 +5769,95 @@
           </w:p>
         </w:tc>
         <w:tc>
-          <w:tcPr/>
-          <w:p>
-            <w:pPr>
-              <w:pStyle w:val="Compact"/>
+          <w:tcPr>
+            <w:tcW w:type="dxa" w:w="1417"/>
+          </w:tcPr>
+          <w:p>
+            <w:pPr>
+              <w:pStyle w:val="Compact"/>
+              <w:keepNext/>
+            </w:pPr>
+            <w:r>
+              <w:rPr>
+                <w:rFonts w:hint="eastAsia"/>
+              </w:rPr>
+              <w:t xml:space="preserve">三驱兄弟</w:t>
+            </w:r>
+          </w:p>
+        </w:tc>
+      </w:tr>
+      <w:tr>
+        <w:trPr>
+          <w:cantSplit/>
+        </w:trPr>
+        <w:tc>
+          <w:tcPr>
+            <w:tcW w:type="dxa" w:w="1361"/>
+          </w:tcPr>
+          <w:p>
+            <w:pPr>
+              <w:pStyle w:val="Compact"/>
+              <w:keepNext w:val="0"/>
+            </w:pPr>
+            <w:r>
+              <w:t xml:space="preserve">v1.1 </w:t>
+            </w:r>
+            <w:r>
+              <w:rPr>
+                <w:rFonts w:hint="eastAsia"/>
+              </w:rPr>
+              <w:t xml:space="preserve">图示修订</w:t>
+            </w:r>
+          </w:p>
+        </w:tc>
+        <w:tc>
+          <w:tcPr>
+            <w:tcW w:type="dxa" w:w="1417"/>
+          </w:tcPr>
+          <w:p>
+            <w:pPr>
+              <w:pStyle w:val="Compact"/>
+              <w:keepNext w:val="0"/>
+            </w:pPr>
+            <w:r>
+              <w:t xml:space="preserve">2026-10-26</w:t>
+            </w:r>
+          </w:p>
+        </w:tc>
+        <w:tc>
+          <w:tcPr>
+            <w:tcW w:type="dxa" w:w="4989"/>
+          </w:tcPr>
+          <w:p>
+            <w:pPr>
+              <w:pStyle w:val="Compact"/>
+              <w:keepNext w:val="0"/>
+            </w:pPr>
+            <w:r>
+              <w:rPr>
+                <w:rFonts w:hint="eastAsia"/>
+              </w:rPr>
+              <w:t xml:space="preserve">补充</w:t>
+            </w:r>
+            <w:r>
+              <w:t xml:space="preserve"> SVG </w:t>
+            </w:r>
+            <w:r>
+              <w:rPr>
+                <w:rFonts w:hint="eastAsia"/>
+              </w:rPr>
+              <w:t xml:space="preserve">架构、流程与验证示意图及可编辑源文件；图示按当前实现标注边界，性能数据口径不变</w:t>
+            </w:r>
+          </w:p>
+        </w:tc>
+        <w:tc>
+          <w:tcPr>
+            <w:tcW w:type="dxa" w:w="1417"/>
+          </w:tcPr>
+          <w:p>
+            <w:pPr>
+              <w:pStyle w:val="Compact"/>
+              <w:keepNext w:val="0"/>
             </w:pPr>
             <w:r>
               <w:rPr>
@@ -5918,8 +5869,18 @@
         </w:tc>
       </w:tr>
     </w:tbl>
-    <w:bookmarkEnd w:id="20"/>
-    <w:bookmarkEnd w:id="21"/>
+    <w:bookmarkEnd w:id="26"/>
+    <w:bookmarkEnd w:id="27"/>
+    <w:p>
+      <w:pPr>
+        <w:keepNext w:val="0"/>
+        <w:spacing w:before="0" w:after="0" w:line="20" w:lineRule="exact"/>
+        <w:rPr>
+          <w:sz w:val="2"/>
+          <w:szCs w:val="2"/>
+        </w:rPr>
+      </w:pPr>
+    </w:p>
     <w:sectPr>
       <w:headerReference w:type="default" r:id="rId9"/>
       <w:footerReference w:type="default" r:id="rId10"/>

</xml_diff>